<commit_message>
single-slice detection of objects
</commit_message>
<xml_diff>
--- a/2026-10-18 thomas workflow.docx
+++ b/2026-10-18 thomas workflow.docx
@@ -2,6 +2,11 @@
 <file path=word/document.xml><?xml version="1.0" encoding="utf-8"?>
 <w:document xmlns:wpc="http://schemas.microsoft.com/office/word/2010/wordprocessingCanvas" xmlns:cx="http://schemas.microsoft.com/office/drawing/2014/chartex" xmlns:cx1="http://schemas.microsoft.com/office/drawing/2015/9/8/chartex" xmlns:cx2="http://schemas.microsoft.com/office/drawing/2015/10/21/chartex" xmlns:cx3="http://schemas.microsoft.com/office/drawing/2016/5/9/chartex" xmlns:cx4="http://schemas.microsoft.com/office/drawing/2016/5/10/chartex" xmlns:cx5="http://schemas.microsoft.com/office/drawing/2016/5/11/chartex" xmlns:cx6="http://schemas.microsoft.com/office/drawing/2016/5/12/chartex" xmlns:cx7="http://schemas.microsoft.com/office/drawing/2016/5/13/chartex" xmlns:cx8="http://schemas.microsoft.com/office/drawing/2016/5/14/chartex" xmlns:mc="http://schemas.openxmlformats.org/markup-compatibility/2006" xmlns:m="http://schemas.openxmlformats.org/officeDocument/2006/math" xmlns:aink="http://schemas.microsoft.com/office/drawing/2016/ink" xmlns:am3d="http://schemas.microsoft.com/office/drawing/2017/model3d" xmlns:oel="http://schemas.microsoft.com/office/2019/extlst" xmlns:r="http://schemas.openxmlformats.org/officeDocument/2006/relationships" xmlns:wp14="http://schemas.microsoft.com/office/word/2010/wordprocessingDrawing" xmlns:wp="http://schemas.openxmlformats.org/drawingml/2006/wordprocessingDrawing" xmlns:wpg="http://schemas.microsoft.com/office/word/2010/wordprocessingGroup" xmlns:wpi="http://schemas.microsoft.com/office/word/2010/wordprocessingInk" xmlns:wps="http://schemas.microsoft.com/office/word/2010/wordprocessingShape" xmlns:o="urn:schemas-microsoft-com:office:office" xmlns:v="urn:schemas-microsoft-com:vml" xmlns:w10="urn:schemas-microsoft-com:office:word" xmlns:w="http://schemas.openxmlformats.org/wordprocessingml/2006/main" xmlns:w14="http://schemas.microsoft.com/office/word/2010/wordml" xmlns:w15="http://schemas.microsoft.com/office/word/2012/wordml" xmlns:w16cex="http://schemas.microsoft.com/office/word/2018/wordml/cex" xmlns:w16cid="http://schemas.microsoft.com/office/word/2016/wordml/cid" xmlns:w16="http://schemas.microsoft.com/office/word/2018/wordml" xmlns:w16sdtdh="http://schemas.microsoft.com/office/word/2020/wordml/sdtdatahash" xmlns:w16sdtfl="http://schemas.microsoft.com/office/word/2024/wordml/sdtformatlock" xmlns:w16se="http://schemas.microsoft.com/office/word/2015/wordml/symex" xmlns:w16du="http://schemas.microsoft.com/office/word/2023/wordml/word16du" xmlns:wne="http://schemas.microsoft.com/office/word/2006/wordml" mc:Ignorable="w14 w15 w16se w16cid w16 w16cex w16sdtdh w16sdtfl w16du wp14">
   <w:body>
+    <w:p>
+      <w:r>
+        <w:t>Workflow with max projections</w:t>
+      </w:r>
+    </w:p>
     <w:tbl>
       <w:tblPr>
         <w:tblStyle w:val="GridTable6Colorful"/>
@@ -712,7 +717,23 @@
                 <w:sz w:val="20"/>
                 <w:szCs w:val="20"/>
               </w:rPr>
-              <w:t xml:space="preserve"> with vesicles in each max projection; outlines of </w:t>
+              <w:t xml:space="preserve"> with vesicles in each max projection; outl</w:t>
+            </w:r>
+            <w:proofErr w:type="spellStart"/>
+            <w:r>
+              <w:rPr>
+                <w:sz w:val="20"/>
+                <w:szCs w:val="20"/>
+              </w:rPr>
+              <w:t>ines of</w:t>
+            </w:r>
+            <w:proofErr w:type="spellEnd"/>
+            <w:r>
+              <w:rPr>
+                <w:sz w:val="20"/>
+                <w:szCs w:val="20"/>
+              </w:rPr>
+              <w:t xml:space="preserve"> </w:t>
             </w:r>
             <w:proofErr w:type="spellStart"/>
             <w:r>
@@ -1175,6 +1196,1337 @@
         <w:t xml:space="preserve"> and vesicle detection (start with completely split dataset)</w:t>
       </w:r>
     </w:p>
+    <w:p/>
+    <w:p>
+      <w:r>
+        <w:t>Workflow with single slices</w:t>
+      </w:r>
+    </w:p>
+    <w:tbl>
+      <w:tblPr>
+        <w:tblStyle w:val="GridTable6Colorful"/>
+        <w:tblW w:w="5000" w:type="pct"/>
+        <w:tblLook w:val="04A0" w:firstRow="1" w:lastRow="0" w:firstColumn="1" w:lastColumn="0" w:noHBand="0" w:noVBand="1"/>
+      </w:tblPr>
+      <w:tblGrid>
+        <w:gridCol w:w="635"/>
+        <w:gridCol w:w="3380"/>
+        <w:gridCol w:w="1462"/>
+        <w:gridCol w:w="1374"/>
+        <w:gridCol w:w="2499"/>
+      </w:tblGrid>
+      <w:tr>
+        <w:trPr>
+          <w:cnfStyle w:val="100000000000" w:firstRow="1" w:lastRow="0" w:firstColumn="0" w:lastColumn="0" w:oddVBand="0" w:evenVBand="0" w:oddHBand="0" w:evenHBand="0" w:firstRowFirstColumn="0" w:firstRowLastColumn="0" w:lastRowFirstColumn="0" w:lastRowLastColumn="0"/>
+          <w:trHeight w:val="305"/>
+        </w:trPr>
+        <w:tc>
+          <w:tcPr>
+            <w:cnfStyle w:val="001000000000" w:firstRow="0" w:lastRow="0" w:firstColumn="1" w:lastColumn="0" w:oddVBand="0" w:evenVBand="0" w:oddHBand="0" w:evenHBand="0" w:firstRowFirstColumn="0" w:firstRowLastColumn="0" w:lastRowFirstColumn="0" w:lastRowLastColumn="0"/>
+            <w:tcW w:w="343" w:type="pct"/>
+          </w:tcPr>
+          <w:p>
+            <w:pPr>
+              <w:rPr>
+                <w:sz w:val="20"/>
+                <w:szCs w:val="20"/>
+              </w:rPr>
+            </w:pPr>
+            <w:r>
+              <w:rPr>
+                <w:sz w:val="20"/>
+                <w:szCs w:val="20"/>
+              </w:rPr>
+              <w:t>Step</w:t>
+            </w:r>
+          </w:p>
+        </w:tc>
+        <w:tc>
+          <w:tcPr>
+            <w:tcW w:w="1542" w:type="pct"/>
+          </w:tcPr>
+          <w:p>
+            <w:pPr>
+              <w:cnfStyle w:val="100000000000" w:firstRow="1" w:lastRow="0" w:firstColumn="0" w:lastColumn="0" w:oddVBand="0" w:evenVBand="0" w:oddHBand="0" w:evenHBand="0" w:firstRowFirstColumn="0" w:firstRowLastColumn="0" w:lastRowFirstColumn="0" w:lastRowLastColumn="0"/>
+              <w:rPr>
+                <w:sz w:val="20"/>
+                <w:szCs w:val="20"/>
+              </w:rPr>
+            </w:pPr>
+            <w:r>
+              <w:rPr>
+                <w:sz w:val="20"/>
+                <w:szCs w:val="20"/>
+              </w:rPr>
+              <w:t>Script / Command / Software</w:t>
+            </w:r>
+          </w:p>
+        </w:tc>
+        <w:tc>
+          <w:tcPr>
+            <w:tcW w:w="911" w:type="pct"/>
+          </w:tcPr>
+          <w:p>
+            <w:pPr>
+              <w:cnfStyle w:val="100000000000" w:firstRow="1" w:lastRow="0" w:firstColumn="0" w:lastColumn="0" w:oddVBand="0" w:evenVBand="0" w:oddHBand="0" w:evenHBand="0" w:firstRowFirstColumn="0" w:firstRowLastColumn="0" w:lastRowFirstColumn="0" w:lastRowLastColumn="0"/>
+              <w:rPr>
+                <w:sz w:val="20"/>
+                <w:szCs w:val="20"/>
+              </w:rPr>
+            </w:pPr>
+            <w:r>
+              <w:rPr>
+                <w:sz w:val="20"/>
+                <w:szCs w:val="20"/>
+              </w:rPr>
+              <w:t>Input data</w:t>
+            </w:r>
+          </w:p>
+        </w:tc>
+        <w:tc>
+          <w:tcPr>
+            <w:tcW w:w="801" w:type="pct"/>
+          </w:tcPr>
+          <w:p>
+            <w:pPr>
+              <w:cnfStyle w:val="100000000000" w:firstRow="1" w:lastRow="0" w:firstColumn="0" w:lastColumn="0" w:oddVBand="0" w:evenVBand="0" w:oddHBand="0" w:evenHBand="0" w:firstRowFirstColumn="0" w:firstRowLastColumn="0" w:lastRowFirstColumn="0" w:lastRowLastColumn="0"/>
+              <w:rPr>
+                <w:sz w:val="20"/>
+                <w:szCs w:val="20"/>
+              </w:rPr>
+            </w:pPr>
+            <w:r>
+              <w:rPr>
+                <w:sz w:val="20"/>
+                <w:szCs w:val="20"/>
+              </w:rPr>
+              <w:t>Input parameters</w:t>
+            </w:r>
+          </w:p>
+        </w:tc>
+        <w:tc>
+          <w:tcPr>
+            <w:tcW w:w="1402" w:type="pct"/>
+          </w:tcPr>
+          <w:p>
+            <w:pPr>
+              <w:cnfStyle w:val="100000000000" w:firstRow="1" w:lastRow="0" w:firstColumn="0" w:lastColumn="0" w:oddVBand="0" w:evenVBand="0" w:oddHBand="0" w:evenHBand="0" w:firstRowFirstColumn="0" w:firstRowLastColumn="0" w:lastRowFirstColumn="0" w:lastRowLastColumn="0"/>
+              <w:rPr>
+                <w:sz w:val="20"/>
+                <w:szCs w:val="20"/>
+              </w:rPr>
+            </w:pPr>
+            <w:r>
+              <w:rPr>
+                <w:sz w:val="20"/>
+                <w:szCs w:val="20"/>
+              </w:rPr>
+              <w:t>Output</w:t>
+            </w:r>
+          </w:p>
+        </w:tc>
+      </w:tr>
+      <w:tr>
+        <w:trPr>
+          <w:cnfStyle w:val="000000100000" w:firstRow="0" w:lastRow="0" w:firstColumn="0" w:lastColumn="0" w:oddVBand="0" w:evenVBand="0" w:oddHBand="1" w:evenHBand="0" w:firstRowFirstColumn="0" w:firstRowLastColumn="0" w:lastRowFirstColumn="0" w:lastRowLastColumn="0"/>
+          <w:trHeight w:val="305"/>
+        </w:trPr>
+        <w:tc>
+          <w:tcPr>
+            <w:cnfStyle w:val="001000000000" w:firstRow="0" w:lastRow="0" w:firstColumn="1" w:lastColumn="0" w:oddVBand="0" w:evenVBand="0" w:oddHBand="0" w:evenHBand="0" w:firstRowFirstColumn="0" w:firstRowLastColumn="0" w:lastRowFirstColumn="0" w:lastRowLastColumn="0"/>
+            <w:tcW w:w="343" w:type="pct"/>
+          </w:tcPr>
+          <w:p>
+            <w:pPr>
+              <w:rPr>
+                <w:sz w:val="20"/>
+                <w:szCs w:val="20"/>
+              </w:rPr>
+            </w:pPr>
+            <w:r>
+              <w:rPr>
+                <w:sz w:val="20"/>
+                <w:szCs w:val="20"/>
+              </w:rPr>
+              <w:t>1</w:t>
+            </w:r>
+          </w:p>
+        </w:tc>
+        <w:tc>
+          <w:tcPr>
+            <w:tcW w:w="1542" w:type="pct"/>
+          </w:tcPr>
+          <w:p>
+            <w:pPr>
+              <w:cnfStyle w:val="000000100000" w:firstRow="0" w:lastRow="0" w:firstColumn="0" w:lastColumn="0" w:oddVBand="0" w:evenVBand="0" w:oddHBand="1" w:evenHBand="0" w:firstRowFirstColumn="0" w:firstRowLastColumn="0" w:lastRowFirstColumn="0" w:lastRowLastColumn="0"/>
+              <w:rPr>
+                <w:sz w:val="20"/>
+                <w:szCs w:val="20"/>
+              </w:rPr>
+            </w:pPr>
+            <w:r>
+              <w:rPr>
+                <w:sz w:val="20"/>
+                <w:szCs w:val="20"/>
+              </w:rPr>
+              <w:t xml:space="preserve">Split </w:t>
+            </w:r>
+            <w:proofErr w:type="spellStart"/>
+            <w:r>
+              <w:rPr>
+                <w:sz w:val="20"/>
+                <w:szCs w:val="20"/>
+              </w:rPr>
+              <w:t>Multipoints</w:t>
+            </w:r>
+            <w:proofErr w:type="spellEnd"/>
+            <w:r>
+              <w:rPr>
+                <w:sz w:val="20"/>
+                <w:szCs w:val="20"/>
+              </w:rPr>
+              <w:t xml:space="preserve"> (NIS Elements)</w:t>
+            </w:r>
+          </w:p>
+        </w:tc>
+        <w:tc>
+          <w:tcPr>
+            <w:tcW w:w="911" w:type="pct"/>
+          </w:tcPr>
+          <w:p>
+            <w:pPr>
+              <w:cnfStyle w:val="000000100000" w:firstRow="0" w:lastRow="0" w:firstColumn="0" w:lastColumn="0" w:oddVBand="0" w:evenVBand="0" w:oddHBand="1" w:evenHBand="0" w:firstRowFirstColumn="0" w:firstRowLastColumn="0" w:lastRowFirstColumn="0" w:lastRowLastColumn="0"/>
+              <w:rPr>
+                <w:sz w:val="20"/>
+                <w:szCs w:val="20"/>
+              </w:rPr>
+            </w:pPr>
+            <w:r>
+              <w:rPr>
+                <w:sz w:val="20"/>
+                <w:szCs w:val="20"/>
+              </w:rPr>
+              <w:t>Multipoint time series (ND2 file)</w:t>
+            </w:r>
+          </w:p>
+        </w:tc>
+        <w:tc>
+          <w:tcPr>
+            <w:tcW w:w="801" w:type="pct"/>
+          </w:tcPr>
+          <w:p>
+            <w:pPr>
+              <w:cnfStyle w:val="000000100000" w:firstRow="0" w:lastRow="0" w:firstColumn="0" w:lastColumn="0" w:oddVBand="0" w:evenVBand="0" w:oddHBand="1" w:evenHBand="0" w:firstRowFirstColumn="0" w:firstRowLastColumn="0" w:lastRowFirstColumn="0" w:lastRowLastColumn="0"/>
+              <w:rPr>
+                <w:sz w:val="20"/>
+                <w:szCs w:val="20"/>
+              </w:rPr>
+            </w:pPr>
+            <w:r>
+              <w:rPr>
+                <w:sz w:val="20"/>
+                <w:szCs w:val="20"/>
+              </w:rPr>
+              <w:t>NA</w:t>
+            </w:r>
+          </w:p>
+        </w:tc>
+        <w:tc>
+          <w:tcPr>
+            <w:tcW w:w="1402" w:type="pct"/>
+          </w:tcPr>
+          <w:p>
+            <w:pPr>
+              <w:cnfStyle w:val="000000100000" w:firstRow="0" w:lastRow="0" w:firstColumn="0" w:lastColumn="0" w:oddVBand="0" w:evenVBand="0" w:oddHBand="1" w:evenHBand="0" w:firstRowFirstColumn="0" w:firstRowLastColumn="0" w:lastRowFirstColumn="0" w:lastRowLastColumn="0"/>
+              <w:rPr>
+                <w:sz w:val="20"/>
+                <w:szCs w:val="20"/>
+              </w:rPr>
+            </w:pPr>
+            <w:r>
+              <w:rPr>
+                <w:sz w:val="20"/>
+                <w:szCs w:val="20"/>
+              </w:rPr>
+              <w:t>XY points (CZT ND2)</w:t>
+            </w:r>
+          </w:p>
+        </w:tc>
+      </w:tr>
+      <w:tr>
+        <w:trPr>
+          <w:trHeight w:val="305"/>
+        </w:trPr>
+        <w:tc>
+          <w:tcPr>
+            <w:cnfStyle w:val="001000000000" w:firstRow="0" w:lastRow="0" w:firstColumn="1" w:lastColumn="0" w:oddVBand="0" w:evenVBand="0" w:oddHBand="0" w:evenHBand="0" w:firstRowFirstColumn="0" w:firstRowLastColumn="0" w:lastRowFirstColumn="0" w:lastRowLastColumn="0"/>
+            <w:tcW w:w="343" w:type="pct"/>
+          </w:tcPr>
+          <w:p>
+            <w:pPr>
+              <w:rPr>
+                <w:sz w:val="20"/>
+                <w:szCs w:val="20"/>
+              </w:rPr>
+            </w:pPr>
+            <w:r>
+              <w:rPr>
+                <w:sz w:val="20"/>
+                <w:szCs w:val="20"/>
+              </w:rPr>
+              <w:t>2</w:t>
+            </w:r>
+          </w:p>
+        </w:tc>
+        <w:tc>
+          <w:tcPr>
+            <w:tcW w:w="1542" w:type="pct"/>
+          </w:tcPr>
+          <w:p>
+            <w:pPr>
+              <w:cnfStyle w:val="000000000000" w:firstRow="0" w:lastRow="0" w:firstColumn="0" w:lastColumn="0" w:oddVBand="0" w:evenVBand="0" w:oddHBand="0" w:evenHBand="0" w:firstRowFirstColumn="0" w:firstRowLastColumn="0" w:lastRowFirstColumn="0" w:lastRowLastColumn="0"/>
+              <w:rPr>
+                <w:sz w:val="20"/>
+                <w:szCs w:val="20"/>
+              </w:rPr>
+            </w:pPr>
+            <w:r>
+              <w:rPr>
+                <w:sz w:val="20"/>
+                <w:szCs w:val="20"/>
+              </w:rPr>
+              <w:t>File &gt; Save As … &gt; Image Sequence</w:t>
+            </w:r>
+          </w:p>
+        </w:tc>
+        <w:tc>
+          <w:tcPr>
+            <w:tcW w:w="911" w:type="pct"/>
+          </w:tcPr>
+          <w:p>
+            <w:pPr>
+              <w:cnfStyle w:val="000000000000" w:firstRow="0" w:lastRow="0" w:firstColumn="0" w:lastColumn="0" w:oddVBand="0" w:evenVBand="0" w:oddHBand="0" w:evenHBand="0" w:firstRowFirstColumn="0" w:firstRowLastColumn="0" w:lastRowFirstColumn="0" w:lastRowLastColumn="0"/>
+              <w:rPr>
+                <w:sz w:val="20"/>
+                <w:szCs w:val="20"/>
+              </w:rPr>
+            </w:pPr>
+            <w:r>
+              <w:rPr>
+                <w:sz w:val="20"/>
+                <w:szCs w:val="20"/>
+              </w:rPr>
+              <w:t xml:space="preserve">Single </w:t>
+            </w:r>
+            <w:r>
+              <w:rPr>
+                <w:sz w:val="20"/>
+                <w:szCs w:val="20"/>
+              </w:rPr>
+              <w:t xml:space="preserve">XY </w:t>
+            </w:r>
+            <w:r>
+              <w:rPr>
+                <w:sz w:val="20"/>
+                <w:szCs w:val="20"/>
+              </w:rPr>
+              <w:t>ND2 files</w:t>
+            </w:r>
+            <w:r>
+              <w:rPr>
+                <w:sz w:val="20"/>
+                <w:szCs w:val="20"/>
+              </w:rPr>
+              <w:t xml:space="preserve"> from one movie (from step 1)</w:t>
+            </w:r>
+          </w:p>
+        </w:tc>
+        <w:tc>
+          <w:tcPr>
+            <w:tcW w:w="801" w:type="pct"/>
+          </w:tcPr>
+          <w:p>
+            <w:pPr>
+              <w:cnfStyle w:val="000000000000" w:firstRow="0" w:lastRow="0" w:firstColumn="0" w:lastColumn="0" w:oddVBand="0" w:evenVBand="0" w:oddHBand="0" w:evenHBand="0" w:firstRowFirstColumn="0" w:firstRowLastColumn="0" w:lastRowFirstColumn="0" w:lastRowLastColumn="0"/>
+              <w:rPr>
+                <w:sz w:val="20"/>
+                <w:szCs w:val="20"/>
+              </w:rPr>
+            </w:pPr>
+            <w:r>
+              <w:rPr>
+                <w:sz w:val="20"/>
+                <w:szCs w:val="20"/>
+              </w:rPr>
+              <w:t># digits for numbering (3); dimension order (CZT?)</w:t>
+            </w:r>
+          </w:p>
+        </w:tc>
+        <w:tc>
+          <w:tcPr>
+            <w:tcW w:w="1402" w:type="pct"/>
+          </w:tcPr>
+          <w:p>
+            <w:pPr>
+              <w:cnfStyle w:val="000000000000" w:firstRow="0" w:lastRow="0" w:firstColumn="0" w:lastColumn="0" w:oddVBand="0" w:evenVBand="0" w:oddHBand="0" w:evenHBand="0" w:firstRowFirstColumn="0" w:firstRowLastColumn="0" w:lastRowFirstColumn="0" w:lastRowLastColumn="0"/>
+              <w:rPr>
+                <w:sz w:val="20"/>
+                <w:szCs w:val="20"/>
+              </w:rPr>
+            </w:pPr>
+            <w:r>
+              <w:rPr>
+                <w:sz w:val="20"/>
+                <w:szCs w:val="20"/>
+              </w:rPr>
+              <w:t xml:space="preserve">Individual </w:t>
+            </w:r>
+            <w:r>
+              <w:rPr>
+                <w:sz w:val="20"/>
+                <w:szCs w:val="20"/>
+              </w:rPr>
+              <w:t>planes (C, Z, T) in format XXX_t000_z000_c000.tif</w:t>
+            </w:r>
+          </w:p>
+        </w:tc>
+      </w:tr>
+      <w:tr>
+        <w:trPr>
+          <w:cnfStyle w:val="000000100000" w:firstRow="0" w:lastRow="0" w:firstColumn="0" w:lastColumn="0" w:oddVBand="0" w:evenVBand="0" w:oddHBand="1" w:evenHBand="0" w:firstRowFirstColumn="0" w:firstRowLastColumn="0" w:lastRowFirstColumn="0" w:lastRowLastColumn="0"/>
+          <w:trHeight w:val="292"/>
+        </w:trPr>
+        <w:tc>
+          <w:tcPr>
+            <w:cnfStyle w:val="001000000000" w:firstRow="0" w:lastRow="0" w:firstColumn="1" w:lastColumn="0" w:oddVBand="0" w:evenVBand="0" w:oddHBand="0" w:evenHBand="0" w:firstRowFirstColumn="0" w:firstRowLastColumn="0" w:lastRowFirstColumn="0" w:lastRowLastColumn="0"/>
+            <w:tcW w:w="343" w:type="pct"/>
+          </w:tcPr>
+          <w:p>
+            <w:pPr>
+              <w:rPr>
+                <w:sz w:val="20"/>
+                <w:szCs w:val="20"/>
+              </w:rPr>
+            </w:pPr>
+            <w:r>
+              <w:rPr>
+                <w:sz w:val="20"/>
+                <w:szCs w:val="20"/>
+              </w:rPr>
+              <w:lastRenderedPageBreak/>
+              <w:t>3</w:t>
+            </w:r>
+          </w:p>
+        </w:tc>
+        <w:tc>
+          <w:tcPr>
+            <w:tcW w:w="1542" w:type="pct"/>
+          </w:tcPr>
+          <w:p>
+            <w:pPr>
+              <w:cnfStyle w:val="000000100000" w:firstRow="0" w:lastRow="0" w:firstColumn="0" w:lastColumn="0" w:oddVBand="0" w:evenVBand="0" w:oddHBand="1" w:evenHBand="0" w:firstRowFirstColumn="0" w:firstRowLastColumn="0" w:lastRowFirstColumn="0" w:lastRowLastColumn="0"/>
+              <w:rPr>
+                <w:sz w:val="20"/>
+                <w:szCs w:val="20"/>
+              </w:rPr>
+            </w:pPr>
+            <w:r>
+              <w:rPr>
+                <w:sz w:val="20"/>
+                <w:szCs w:val="20"/>
+              </w:rPr>
+              <w:t>split_time_batch.py (Fiji)</w:t>
+            </w:r>
+          </w:p>
+        </w:tc>
+        <w:tc>
+          <w:tcPr>
+            <w:tcW w:w="911" w:type="pct"/>
+          </w:tcPr>
+          <w:p>
+            <w:pPr>
+              <w:cnfStyle w:val="000000100000" w:firstRow="0" w:lastRow="0" w:firstColumn="0" w:lastColumn="0" w:oddVBand="0" w:evenVBand="0" w:oddHBand="1" w:evenHBand="0" w:firstRowFirstColumn="0" w:firstRowLastColumn="0" w:lastRowFirstColumn="0" w:lastRowLastColumn="0"/>
+              <w:rPr>
+                <w:sz w:val="20"/>
+                <w:szCs w:val="20"/>
+              </w:rPr>
+            </w:pPr>
+            <w:r>
+              <w:rPr>
+                <w:sz w:val="20"/>
+                <w:szCs w:val="20"/>
+              </w:rPr>
+              <w:t>Batch of XY points from one movie (from step 1)</w:t>
+            </w:r>
+          </w:p>
+        </w:tc>
+        <w:tc>
+          <w:tcPr>
+            <w:tcW w:w="801" w:type="pct"/>
+          </w:tcPr>
+          <w:p>
+            <w:pPr>
+              <w:cnfStyle w:val="000000100000" w:firstRow="0" w:lastRow="0" w:firstColumn="0" w:lastColumn="0" w:oddVBand="0" w:evenVBand="0" w:oddHBand="1" w:evenHBand="0" w:firstRowFirstColumn="0" w:firstRowLastColumn="0" w:lastRowFirstColumn="0" w:lastRowLastColumn="0"/>
+              <w:rPr>
+                <w:sz w:val="20"/>
+                <w:szCs w:val="20"/>
+              </w:rPr>
+            </w:pPr>
+            <w:r>
+              <w:rPr>
+                <w:sz w:val="20"/>
+                <w:szCs w:val="20"/>
+              </w:rPr>
+              <w:t># timepoints</w:t>
+            </w:r>
+          </w:p>
+        </w:tc>
+        <w:tc>
+          <w:tcPr>
+            <w:tcW w:w="1402" w:type="pct"/>
+          </w:tcPr>
+          <w:p>
+            <w:pPr>
+              <w:cnfStyle w:val="000000100000" w:firstRow="0" w:lastRow="0" w:firstColumn="0" w:lastColumn="0" w:oddVBand="0" w:evenVBand="0" w:oddHBand="1" w:evenHBand="0" w:firstRowFirstColumn="0" w:firstRowLastColumn="0" w:lastRowFirstColumn="0" w:lastRowLastColumn="0"/>
+              <w:rPr>
+                <w:sz w:val="20"/>
+                <w:szCs w:val="20"/>
+              </w:rPr>
+            </w:pPr>
+            <w:r>
+              <w:rPr>
+                <w:sz w:val="20"/>
+                <w:szCs w:val="20"/>
+              </w:rPr>
+              <w:t>Individual timepoints (CZ tiff)</w:t>
+            </w:r>
+          </w:p>
+        </w:tc>
+      </w:tr>
+      <w:tr>
+        <w:trPr>
+          <w:trHeight w:val="292"/>
+        </w:trPr>
+        <w:tc>
+          <w:tcPr>
+            <w:cnfStyle w:val="001000000000" w:firstRow="0" w:lastRow="0" w:firstColumn="1" w:lastColumn="0" w:oddVBand="0" w:evenVBand="0" w:oddHBand="0" w:evenHBand="0" w:firstRowFirstColumn="0" w:firstRowLastColumn="0" w:lastRowFirstColumn="0" w:lastRowLastColumn="0"/>
+            <w:tcW w:w="343" w:type="pct"/>
+          </w:tcPr>
+          <w:p>
+            <w:pPr>
+              <w:rPr>
+                <w:sz w:val="20"/>
+                <w:szCs w:val="20"/>
+              </w:rPr>
+            </w:pPr>
+            <w:r>
+              <w:rPr>
+                <w:sz w:val="20"/>
+                <w:szCs w:val="20"/>
+              </w:rPr>
+              <w:t>4</w:t>
+            </w:r>
+          </w:p>
+        </w:tc>
+        <w:tc>
+          <w:tcPr>
+            <w:tcW w:w="1542" w:type="pct"/>
+          </w:tcPr>
+          <w:p>
+            <w:pPr>
+              <w:cnfStyle w:val="000000000000" w:firstRow="0" w:lastRow="0" w:firstColumn="0" w:lastColumn="0" w:oddVBand="0" w:evenVBand="0" w:oddHBand="0" w:evenHBand="0" w:firstRowFirstColumn="0" w:firstRowLastColumn="0" w:lastRowFirstColumn="0" w:lastRowLastColumn="0"/>
+              <w:rPr>
+                <w:sz w:val="20"/>
+                <w:szCs w:val="20"/>
+              </w:rPr>
+            </w:pPr>
+            <w:proofErr w:type="spellStart"/>
+            <w:r>
+              <w:rPr>
+                <w:sz w:val="20"/>
+                <w:szCs w:val="20"/>
+              </w:rPr>
+              <w:t>max_project_batch.ijm</w:t>
+            </w:r>
+            <w:proofErr w:type="spellEnd"/>
+            <w:r>
+              <w:rPr>
+                <w:sz w:val="20"/>
+                <w:szCs w:val="20"/>
+              </w:rPr>
+              <w:t xml:space="preserve"> (Fiji)</w:t>
+            </w:r>
+          </w:p>
+        </w:tc>
+        <w:tc>
+          <w:tcPr>
+            <w:tcW w:w="911" w:type="pct"/>
+          </w:tcPr>
+          <w:p>
+            <w:pPr>
+              <w:cnfStyle w:val="000000000000" w:firstRow="0" w:lastRow="0" w:firstColumn="0" w:lastColumn="0" w:oddVBand="0" w:evenVBand="0" w:oddHBand="0" w:evenHBand="0" w:firstRowFirstColumn="0" w:firstRowLastColumn="0" w:lastRowFirstColumn="0" w:lastRowLastColumn="0"/>
+              <w:rPr>
+                <w:sz w:val="20"/>
+                <w:szCs w:val="20"/>
+              </w:rPr>
+            </w:pPr>
+            <w:r>
+              <w:rPr>
+                <w:sz w:val="20"/>
+                <w:szCs w:val="20"/>
+              </w:rPr>
+              <w:t xml:space="preserve">Batch of timepoint Z stacks from step </w:t>
+            </w:r>
+            <w:r>
+              <w:rPr>
+                <w:sz w:val="20"/>
+                <w:szCs w:val="20"/>
+              </w:rPr>
+              <w:t>3</w:t>
+            </w:r>
+            <w:r>
+              <w:rPr>
+                <w:sz w:val="20"/>
+                <w:szCs w:val="20"/>
+              </w:rPr>
+              <w:t xml:space="preserve"> (can be from multiple runs)</w:t>
+            </w:r>
+          </w:p>
+        </w:tc>
+        <w:tc>
+          <w:tcPr>
+            <w:tcW w:w="801" w:type="pct"/>
+          </w:tcPr>
+          <w:p>
+            <w:pPr>
+              <w:cnfStyle w:val="000000000000" w:firstRow="0" w:lastRow="0" w:firstColumn="0" w:lastColumn="0" w:oddVBand="0" w:evenVBand="0" w:oddHBand="0" w:evenHBand="0" w:firstRowFirstColumn="0" w:firstRowLastColumn="0" w:lastRowFirstColumn="0" w:lastRowLastColumn="0"/>
+              <w:rPr>
+                <w:sz w:val="20"/>
+                <w:szCs w:val="20"/>
+              </w:rPr>
+            </w:pPr>
+            <w:r>
+              <w:rPr>
+                <w:sz w:val="20"/>
+                <w:szCs w:val="20"/>
+              </w:rPr>
+              <w:t>NA</w:t>
+            </w:r>
+          </w:p>
+        </w:tc>
+        <w:tc>
+          <w:tcPr>
+            <w:tcW w:w="1402" w:type="pct"/>
+          </w:tcPr>
+          <w:p>
+            <w:pPr>
+              <w:cnfStyle w:val="000000000000" w:firstRow="0" w:lastRow="0" w:firstColumn="0" w:lastColumn="0" w:oddVBand="0" w:evenVBand="0" w:oddHBand="0" w:evenHBand="0" w:firstRowFirstColumn="0" w:firstRowLastColumn="0" w:lastRowFirstColumn="0" w:lastRowLastColumn="0"/>
+              <w:rPr>
+                <w:sz w:val="20"/>
+                <w:szCs w:val="20"/>
+              </w:rPr>
+            </w:pPr>
+            <w:r>
+              <w:rPr>
+                <w:sz w:val="20"/>
+                <w:szCs w:val="20"/>
+              </w:rPr>
+              <w:t>Max projections (multichannel tiff)</w:t>
+            </w:r>
+          </w:p>
+        </w:tc>
+      </w:tr>
+      <w:tr>
+        <w:trPr>
+          <w:cnfStyle w:val="000000100000" w:firstRow="0" w:lastRow="0" w:firstColumn="0" w:lastColumn="0" w:oddVBand="0" w:evenVBand="0" w:oddHBand="1" w:evenHBand="0" w:firstRowFirstColumn="0" w:firstRowLastColumn="0" w:lastRowFirstColumn="0" w:lastRowLastColumn="0"/>
+          <w:trHeight w:val="305"/>
+        </w:trPr>
+        <w:tc>
+          <w:tcPr>
+            <w:cnfStyle w:val="001000000000" w:firstRow="0" w:lastRow="0" w:firstColumn="1" w:lastColumn="0" w:oddVBand="0" w:evenVBand="0" w:oddHBand="0" w:evenHBand="0" w:firstRowFirstColumn="0" w:firstRowLastColumn="0" w:lastRowFirstColumn="0" w:lastRowLastColumn="0"/>
+            <w:tcW w:w="343" w:type="pct"/>
+          </w:tcPr>
+          <w:p>
+            <w:pPr>
+              <w:rPr>
+                <w:i/>
+                <w:iCs/>
+                <w:sz w:val="20"/>
+                <w:szCs w:val="20"/>
+              </w:rPr>
+            </w:pPr>
+            <w:r>
+              <w:rPr>
+                <w:i/>
+                <w:iCs/>
+                <w:sz w:val="20"/>
+                <w:szCs w:val="20"/>
+              </w:rPr>
+              <w:t>4</w:t>
+            </w:r>
+          </w:p>
+        </w:tc>
+        <w:tc>
+          <w:tcPr>
+            <w:tcW w:w="1542" w:type="pct"/>
+          </w:tcPr>
+          <w:p>
+            <w:pPr>
+              <w:cnfStyle w:val="000000100000" w:firstRow="0" w:lastRow="0" w:firstColumn="0" w:lastColumn="0" w:oddVBand="0" w:evenVBand="0" w:oddHBand="1" w:evenHBand="0" w:firstRowFirstColumn="0" w:firstRowLastColumn="0" w:lastRowFirstColumn="0" w:lastRowLastColumn="0"/>
+              <w:rPr>
+                <w:i/>
+                <w:iCs/>
+                <w:sz w:val="20"/>
+                <w:szCs w:val="20"/>
+              </w:rPr>
+            </w:pPr>
+            <w:proofErr w:type="spellStart"/>
+            <w:r>
+              <w:rPr>
+                <w:sz w:val="20"/>
+                <w:szCs w:val="20"/>
+              </w:rPr>
+              <w:t>Rbody_localization</w:t>
+            </w:r>
+            <w:r>
+              <w:rPr>
+                <w:sz w:val="20"/>
+                <w:szCs w:val="20"/>
+              </w:rPr>
+              <w:t>_</w:t>
+            </w:r>
+            <w:proofErr w:type="gramStart"/>
+            <w:r>
+              <w:rPr>
+                <w:sz w:val="20"/>
+                <w:szCs w:val="20"/>
+              </w:rPr>
+              <w:t>slice</w:t>
+            </w:r>
+            <w:r>
+              <w:rPr>
+                <w:sz w:val="20"/>
+                <w:szCs w:val="20"/>
+              </w:rPr>
+              <w:t>.cpproj</w:t>
+            </w:r>
+            <w:proofErr w:type="spellEnd"/>
+            <w:proofErr w:type="gramEnd"/>
+            <w:r>
+              <w:rPr>
+                <w:sz w:val="20"/>
+                <w:szCs w:val="20"/>
+              </w:rPr>
+              <w:t xml:space="preserve"> </w:t>
+            </w:r>
+            <w:r>
+              <w:rPr>
+                <w:i/>
+                <w:iCs/>
+                <w:sz w:val="20"/>
+                <w:szCs w:val="20"/>
+              </w:rPr>
+              <w:t xml:space="preserve">or </w:t>
+            </w:r>
+            <w:proofErr w:type="spellStart"/>
+            <w:r>
+              <w:rPr>
+                <w:i/>
+                <w:iCs/>
+                <w:sz w:val="20"/>
+                <w:szCs w:val="20"/>
+              </w:rPr>
+              <w:t>Rbody_localization_lyso</w:t>
+            </w:r>
+            <w:r>
+              <w:rPr>
+                <w:i/>
+                <w:iCs/>
+                <w:sz w:val="20"/>
+                <w:szCs w:val="20"/>
+              </w:rPr>
+              <w:t>_</w:t>
+            </w:r>
+            <w:proofErr w:type="gramStart"/>
+            <w:r>
+              <w:rPr>
+                <w:i/>
+                <w:iCs/>
+                <w:sz w:val="20"/>
+                <w:szCs w:val="20"/>
+              </w:rPr>
+              <w:t>slice</w:t>
+            </w:r>
+            <w:r>
+              <w:rPr>
+                <w:i/>
+                <w:iCs/>
+                <w:sz w:val="20"/>
+                <w:szCs w:val="20"/>
+              </w:rPr>
+              <w:t>.cpproj</w:t>
+            </w:r>
+            <w:proofErr w:type="spellEnd"/>
+            <w:proofErr w:type="gramEnd"/>
+            <w:r>
+              <w:rPr>
+                <w:i/>
+                <w:iCs/>
+                <w:sz w:val="20"/>
+                <w:szCs w:val="20"/>
+              </w:rPr>
+              <w:t xml:space="preserve"> </w:t>
+            </w:r>
+            <w:r>
+              <w:rPr>
+                <w:sz w:val="20"/>
+                <w:szCs w:val="20"/>
+              </w:rPr>
+              <w:t>(</w:t>
+            </w:r>
+            <w:proofErr w:type="spellStart"/>
+            <w:r>
+              <w:rPr>
+                <w:sz w:val="20"/>
+                <w:szCs w:val="20"/>
+              </w:rPr>
+              <w:t>CellProfiler</w:t>
+            </w:r>
+            <w:proofErr w:type="spellEnd"/>
+            <w:r>
+              <w:rPr>
+                <w:sz w:val="20"/>
+                <w:szCs w:val="20"/>
+              </w:rPr>
+              <w:t>)</w:t>
+            </w:r>
+          </w:p>
+        </w:tc>
+        <w:tc>
+          <w:tcPr>
+            <w:tcW w:w="911" w:type="pct"/>
+          </w:tcPr>
+          <w:p>
+            <w:pPr>
+              <w:cnfStyle w:val="000000100000" w:firstRow="0" w:lastRow="0" w:firstColumn="0" w:lastColumn="0" w:oddVBand="0" w:evenVBand="0" w:oddHBand="1" w:evenHBand="0" w:firstRowFirstColumn="0" w:firstRowLastColumn="0" w:lastRowFirstColumn="0" w:lastRowLastColumn="0"/>
+              <w:rPr>
+                <w:sz w:val="20"/>
+                <w:szCs w:val="20"/>
+              </w:rPr>
+            </w:pPr>
+            <w:r>
+              <w:rPr>
+                <w:sz w:val="20"/>
+                <w:szCs w:val="20"/>
+              </w:rPr>
+              <w:t xml:space="preserve">Max projections from step </w:t>
+            </w:r>
+            <w:r>
+              <w:rPr>
+                <w:sz w:val="20"/>
+                <w:szCs w:val="20"/>
+              </w:rPr>
+              <w:t>4; single plane images from step 2</w:t>
+            </w:r>
+          </w:p>
+        </w:tc>
+        <w:tc>
+          <w:tcPr>
+            <w:tcW w:w="801" w:type="pct"/>
+          </w:tcPr>
+          <w:p>
+            <w:pPr>
+              <w:cnfStyle w:val="000000100000" w:firstRow="0" w:lastRow="0" w:firstColumn="0" w:lastColumn="0" w:oddVBand="0" w:evenVBand="0" w:oddHBand="1" w:evenHBand="0" w:firstRowFirstColumn="0" w:firstRowLastColumn="0" w:lastRowFirstColumn="0" w:lastRowLastColumn="0"/>
+              <w:rPr>
+                <w:sz w:val="20"/>
+                <w:szCs w:val="20"/>
+              </w:rPr>
+            </w:pPr>
+          </w:p>
+        </w:tc>
+        <w:tc>
+          <w:tcPr>
+            <w:tcW w:w="1402" w:type="pct"/>
+          </w:tcPr>
+          <w:p>
+            <w:pPr>
+              <w:cnfStyle w:val="000000100000" w:firstRow="0" w:lastRow="0" w:firstColumn="0" w:lastColumn="0" w:oddVBand="0" w:evenVBand="0" w:oddHBand="1" w:evenHBand="0" w:firstRowFirstColumn="0" w:firstRowLastColumn="0" w:lastRowFirstColumn="0" w:lastRowLastColumn="0"/>
+              <w:rPr>
+                <w:sz w:val="20"/>
+                <w:szCs w:val="20"/>
+              </w:rPr>
+            </w:pPr>
+            <w:r>
+              <w:rPr>
+                <w:sz w:val="20"/>
+                <w:szCs w:val="20"/>
+              </w:rPr>
+              <w:t xml:space="preserve">Counts of </w:t>
+            </w:r>
+            <w:proofErr w:type="spellStart"/>
+            <w:r>
+              <w:rPr>
+                <w:sz w:val="20"/>
+                <w:szCs w:val="20"/>
+              </w:rPr>
+              <w:t>Rbodies</w:t>
+            </w:r>
+            <w:proofErr w:type="spellEnd"/>
+            <w:r>
+              <w:rPr>
+                <w:sz w:val="20"/>
+                <w:szCs w:val="20"/>
+              </w:rPr>
+              <w:t xml:space="preserve"> ≥ with 50% of area overlapping with vesicles in each </w:t>
+            </w:r>
+            <w:r>
+              <w:rPr>
+                <w:sz w:val="20"/>
+                <w:szCs w:val="20"/>
+              </w:rPr>
+              <w:t>slice 2</w:t>
+            </w:r>
+            <w:r>
+              <w:rPr>
+                <w:sz w:val="20"/>
+                <w:szCs w:val="20"/>
+              </w:rPr>
+              <w:t xml:space="preserve">; outlines of </w:t>
+            </w:r>
+            <w:proofErr w:type="spellStart"/>
+            <w:r>
+              <w:rPr>
+                <w:sz w:val="20"/>
+                <w:szCs w:val="20"/>
+              </w:rPr>
+              <w:t>Rbodies</w:t>
+            </w:r>
+            <w:proofErr w:type="spellEnd"/>
+            <w:r>
+              <w:rPr>
+                <w:sz w:val="20"/>
+                <w:szCs w:val="20"/>
+              </w:rPr>
+              <w:t>, cells</w:t>
+            </w:r>
+            <w:r>
+              <w:rPr>
+                <w:sz w:val="20"/>
+                <w:szCs w:val="20"/>
+              </w:rPr>
+              <w:t xml:space="preserve"> (based on max </w:t>
+            </w:r>
+            <w:proofErr w:type="spellStart"/>
+            <w:r>
+              <w:rPr>
+                <w:sz w:val="20"/>
+                <w:szCs w:val="20"/>
+              </w:rPr>
+              <w:t>proj</w:t>
+            </w:r>
+            <w:proofErr w:type="spellEnd"/>
+            <w:r>
+              <w:rPr>
+                <w:sz w:val="20"/>
+                <w:szCs w:val="20"/>
+              </w:rPr>
+              <w:t>)</w:t>
+            </w:r>
+            <w:r>
+              <w:rPr>
+                <w:sz w:val="20"/>
+                <w:szCs w:val="20"/>
+              </w:rPr>
+              <w:t>, vesicles, and colocalized objects</w:t>
+            </w:r>
+            <w:r>
+              <w:rPr>
+                <w:sz w:val="20"/>
+                <w:szCs w:val="20"/>
+              </w:rPr>
+              <w:t xml:space="preserve"> (based on single slice)</w:t>
+            </w:r>
+          </w:p>
+        </w:tc>
+      </w:tr>
+      <w:tr>
+        <w:trPr>
+          <w:trHeight w:val="305"/>
+        </w:trPr>
+        <w:tc>
+          <w:tcPr>
+            <w:cnfStyle w:val="001000000000" w:firstRow="0" w:lastRow="0" w:firstColumn="1" w:lastColumn="0" w:oddVBand="0" w:evenVBand="0" w:oddHBand="0" w:evenHBand="0" w:firstRowFirstColumn="0" w:firstRowLastColumn="0" w:lastRowFirstColumn="0" w:lastRowLastColumn="0"/>
+            <w:tcW w:w="343" w:type="pct"/>
+          </w:tcPr>
+          <w:p>
+            <w:pPr>
+              <w:rPr>
+                <w:sz w:val="20"/>
+                <w:szCs w:val="20"/>
+              </w:rPr>
+            </w:pPr>
+          </w:p>
+        </w:tc>
+        <w:tc>
+          <w:tcPr>
+            <w:tcW w:w="1542" w:type="pct"/>
+          </w:tcPr>
+          <w:p>
+            <w:pPr>
+              <w:cnfStyle w:val="000000000000" w:firstRow="0" w:lastRow="0" w:firstColumn="0" w:lastColumn="0" w:oddVBand="0" w:evenVBand="0" w:oddHBand="0" w:evenHBand="0" w:firstRowFirstColumn="0" w:firstRowLastColumn="0" w:lastRowFirstColumn="0" w:lastRowLastColumn="0"/>
+              <w:rPr>
+                <w:sz w:val="20"/>
+                <w:szCs w:val="20"/>
+              </w:rPr>
+            </w:pPr>
+          </w:p>
+        </w:tc>
+        <w:tc>
+          <w:tcPr>
+            <w:tcW w:w="911" w:type="pct"/>
+          </w:tcPr>
+          <w:p>
+            <w:pPr>
+              <w:cnfStyle w:val="000000000000" w:firstRow="0" w:lastRow="0" w:firstColumn="0" w:lastColumn="0" w:oddVBand="0" w:evenVBand="0" w:oddHBand="0" w:evenHBand="0" w:firstRowFirstColumn="0" w:firstRowLastColumn="0" w:lastRowFirstColumn="0" w:lastRowLastColumn="0"/>
+              <w:rPr>
+                <w:sz w:val="20"/>
+                <w:szCs w:val="20"/>
+              </w:rPr>
+            </w:pPr>
+          </w:p>
+        </w:tc>
+        <w:tc>
+          <w:tcPr>
+            <w:tcW w:w="801" w:type="pct"/>
+          </w:tcPr>
+          <w:p>
+            <w:pPr>
+              <w:cnfStyle w:val="000000000000" w:firstRow="0" w:lastRow="0" w:firstColumn="0" w:lastColumn="0" w:oddVBand="0" w:evenVBand="0" w:oddHBand="0" w:evenHBand="0" w:firstRowFirstColumn="0" w:firstRowLastColumn="0" w:lastRowFirstColumn="0" w:lastRowLastColumn="0"/>
+              <w:rPr>
+                <w:sz w:val="20"/>
+                <w:szCs w:val="20"/>
+              </w:rPr>
+            </w:pPr>
+          </w:p>
+        </w:tc>
+        <w:tc>
+          <w:tcPr>
+            <w:tcW w:w="1402" w:type="pct"/>
+          </w:tcPr>
+          <w:p>
+            <w:pPr>
+              <w:cnfStyle w:val="000000000000" w:firstRow="0" w:lastRow="0" w:firstColumn="0" w:lastColumn="0" w:oddVBand="0" w:evenVBand="0" w:oddHBand="0" w:evenHBand="0" w:firstRowFirstColumn="0" w:firstRowLastColumn="0" w:lastRowFirstColumn="0" w:lastRowLastColumn="0"/>
+              <w:rPr>
+                <w:sz w:val="20"/>
+                <w:szCs w:val="20"/>
+              </w:rPr>
+            </w:pPr>
+          </w:p>
+        </w:tc>
+      </w:tr>
+      <w:tr>
+        <w:trPr>
+          <w:cnfStyle w:val="000000100000" w:firstRow="0" w:lastRow="0" w:firstColumn="0" w:lastColumn="0" w:oddVBand="0" w:evenVBand="0" w:oddHBand="1" w:evenHBand="0" w:firstRowFirstColumn="0" w:firstRowLastColumn="0" w:lastRowFirstColumn="0" w:lastRowLastColumn="0"/>
+          <w:trHeight w:val="305"/>
+        </w:trPr>
+        <w:tc>
+          <w:tcPr>
+            <w:cnfStyle w:val="001000000000" w:firstRow="0" w:lastRow="0" w:firstColumn="1" w:lastColumn="0" w:oddVBand="0" w:evenVBand="0" w:oddHBand="0" w:evenHBand="0" w:firstRowFirstColumn="0" w:firstRowLastColumn="0" w:lastRowFirstColumn="0" w:lastRowLastColumn="0"/>
+            <w:tcW w:w="343" w:type="pct"/>
+          </w:tcPr>
+          <w:p>
+            <w:pPr>
+              <w:rPr>
+                <w:sz w:val="20"/>
+                <w:szCs w:val="20"/>
+              </w:rPr>
+            </w:pPr>
+          </w:p>
+        </w:tc>
+        <w:tc>
+          <w:tcPr>
+            <w:tcW w:w="1542" w:type="pct"/>
+          </w:tcPr>
+          <w:p>
+            <w:pPr>
+              <w:cnfStyle w:val="000000100000" w:firstRow="0" w:lastRow="0" w:firstColumn="0" w:lastColumn="0" w:oddVBand="0" w:evenVBand="0" w:oddHBand="1" w:evenHBand="0" w:firstRowFirstColumn="0" w:firstRowLastColumn="0" w:lastRowFirstColumn="0" w:lastRowLastColumn="0"/>
+              <w:rPr>
+                <w:sz w:val="20"/>
+                <w:szCs w:val="20"/>
+              </w:rPr>
+            </w:pPr>
+          </w:p>
+        </w:tc>
+        <w:tc>
+          <w:tcPr>
+            <w:tcW w:w="911" w:type="pct"/>
+          </w:tcPr>
+          <w:p>
+            <w:pPr>
+              <w:cnfStyle w:val="000000100000" w:firstRow="0" w:lastRow="0" w:firstColumn="0" w:lastColumn="0" w:oddVBand="0" w:evenVBand="0" w:oddHBand="1" w:evenHBand="0" w:firstRowFirstColumn="0" w:firstRowLastColumn="0" w:lastRowFirstColumn="0" w:lastRowLastColumn="0"/>
+              <w:rPr>
+                <w:sz w:val="20"/>
+                <w:szCs w:val="20"/>
+              </w:rPr>
+            </w:pPr>
+          </w:p>
+        </w:tc>
+        <w:tc>
+          <w:tcPr>
+            <w:tcW w:w="801" w:type="pct"/>
+          </w:tcPr>
+          <w:p>
+            <w:pPr>
+              <w:cnfStyle w:val="000000100000" w:firstRow="0" w:lastRow="0" w:firstColumn="0" w:lastColumn="0" w:oddVBand="0" w:evenVBand="0" w:oddHBand="1" w:evenHBand="0" w:firstRowFirstColumn="0" w:firstRowLastColumn="0" w:lastRowFirstColumn="0" w:lastRowLastColumn="0"/>
+              <w:rPr>
+                <w:sz w:val="20"/>
+                <w:szCs w:val="20"/>
+              </w:rPr>
+            </w:pPr>
+          </w:p>
+        </w:tc>
+        <w:tc>
+          <w:tcPr>
+            <w:tcW w:w="1402" w:type="pct"/>
+          </w:tcPr>
+          <w:p>
+            <w:pPr>
+              <w:cnfStyle w:val="000000100000" w:firstRow="0" w:lastRow="0" w:firstColumn="0" w:lastColumn="0" w:oddVBand="0" w:evenVBand="0" w:oddHBand="1" w:evenHBand="0" w:firstRowFirstColumn="0" w:firstRowLastColumn="0" w:lastRowFirstColumn="0" w:lastRowLastColumn="0"/>
+              <w:rPr>
+                <w:sz w:val="20"/>
+                <w:szCs w:val="20"/>
+              </w:rPr>
+            </w:pPr>
+          </w:p>
+        </w:tc>
+      </w:tr>
+      <w:tr>
+        <w:trPr>
+          <w:trHeight w:val="292"/>
+        </w:trPr>
+        <w:tc>
+          <w:tcPr>
+            <w:cnfStyle w:val="001000000000" w:firstRow="0" w:lastRow="0" w:firstColumn="1" w:lastColumn="0" w:oddVBand="0" w:evenVBand="0" w:oddHBand="0" w:evenHBand="0" w:firstRowFirstColumn="0" w:firstRowLastColumn="0" w:lastRowFirstColumn="0" w:lastRowLastColumn="0"/>
+            <w:tcW w:w="343" w:type="pct"/>
+          </w:tcPr>
+          <w:p>
+            <w:pPr>
+              <w:rPr>
+                <w:sz w:val="20"/>
+                <w:szCs w:val="20"/>
+              </w:rPr>
+            </w:pPr>
+          </w:p>
+        </w:tc>
+        <w:tc>
+          <w:tcPr>
+            <w:tcW w:w="1542" w:type="pct"/>
+          </w:tcPr>
+          <w:p>
+            <w:pPr>
+              <w:cnfStyle w:val="000000000000" w:firstRow="0" w:lastRow="0" w:firstColumn="0" w:lastColumn="0" w:oddVBand="0" w:evenVBand="0" w:oddHBand="0" w:evenHBand="0" w:firstRowFirstColumn="0" w:firstRowLastColumn="0" w:lastRowFirstColumn="0" w:lastRowLastColumn="0"/>
+              <w:rPr>
+                <w:sz w:val="20"/>
+                <w:szCs w:val="20"/>
+              </w:rPr>
+            </w:pPr>
+          </w:p>
+        </w:tc>
+        <w:tc>
+          <w:tcPr>
+            <w:tcW w:w="911" w:type="pct"/>
+          </w:tcPr>
+          <w:p>
+            <w:pPr>
+              <w:cnfStyle w:val="000000000000" w:firstRow="0" w:lastRow="0" w:firstColumn="0" w:lastColumn="0" w:oddVBand="0" w:evenVBand="0" w:oddHBand="0" w:evenHBand="0" w:firstRowFirstColumn="0" w:firstRowLastColumn="0" w:lastRowFirstColumn="0" w:lastRowLastColumn="0"/>
+              <w:rPr>
+                <w:sz w:val="20"/>
+                <w:szCs w:val="20"/>
+              </w:rPr>
+            </w:pPr>
+          </w:p>
+        </w:tc>
+        <w:tc>
+          <w:tcPr>
+            <w:tcW w:w="801" w:type="pct"/>
+          </w:tcPr>
+          <w:p>
+            <w:pPr>
+              <w:cnfStyle w:val="000000000000" w:firstRow="0" w:lastRow="0" w:firstColumn="0" w:lastColumn="0" w:oddVBand="0" w:evenVBand="0" w:oddHBand="0" w:evenHBand="0" w:firstRowFirstColumn="0" w:firstRowLastColumn="0" w:lastRowFirstColumn="0" w:lastRowLastColumn="0"/>
+              <w:rPr>
+                <w:sz w:val="20"/>
+                <w:szCs w:val="20"/>
+              </w:rPr>
+            </w:pPr>
+          </w:p>
+        </w:tc>
+        <w:tc>
+          <w:tcPr>
+            <w:tcW w:w="1402" w:type="pct"/>
+          </w:tcPr>
+          <w:p>
+            <w:pPr>
+              <w:cnfStyle w:val="000000000000" w:firstRow="0" w:lastRow="0" w:firstColumn="0" w:lastColumn="0" w:oddVBand="0" w:evenVBand="0" w:oddHBand="0" w:evenHBand="0" w:firstRowFirstColumn="0" w:firstRowLastColumn="0" w:lastRowFirstColumn="0" w:lastRowLastColumn="0"/>
+              <w:rPr>
+                <w:sz w:val="20"/>
+                <w:szCs w:val="20"/>
+              </w:rPr>
+            </w:pPr>
+          </w:p>
+        </w:tc>
+      </w:tr>
+      <w:tr>
+        <w:trPr>
+          <w:cnfStyle w:val="000000100000" w:firstRow="0" w:lastRow="0" w:firstColumn="0" w:lastColumn="0" w:oddVBand="0" w:evenVBand="0" w:oddHBand="1" w:evenHBand="0" w:firstRowFirstColumn="0" w:firstRowLastColumn="0" w:lastRowFirstColumn="0" w:lastRowLastColumn="0"/>
+          <w:trHeight w:val="305"/>
+        </w:trPr>
+        <w:tc>
+          <w:tcPr>
+            <w:cnfStyle w:val="001000000000" w:firstRow="0" w:lastRow="0" w:firstColumn="1" w:lastColumn="0" w:oddVBand="0" w:evenVBand="0" w:oddHBand="0" w:evenHBand="0" w:firstRowFirstColumn="0" w:firstRowLastColumn="0" w:lastRowFirstColumn="0" w:lastRowLastColumn="0"/>
+            <w:tcW w:w="343" w:type="pct"/>
+          </w:tcPr>
+          <w:p>
+            <w:pPr>
+              <w:rPr>
+                <w:sz w:val="20"/>
+                <w:szCs w:val="20"/>
+              </w:rPr>
+            </w:pPr>
+          </w:p>
+        </w:tc>
+        <w:tc>
+          <w:tcPr>
+            <w:tcW w:w="1542" w:type="pct"/>
+          </w:tcPr>
+          <w:p>
+            <w:pPr>
+              <w:cnfStyle w:val="000000100000" w:firstRow="0" w:lastRow="0" w:firstColumn="0" w:lastColumn="0" w:oddVBand="0" w:evenVBand="0" w:oddHBand="1" w:evenHBand="0" w:firstRowFirstColumn="0" w:firstRowLastColumn="0" w:lastRowFirstColumn="0" w:lastRowLastColumn="0"/>
+              <w:rPr>
+                <w:sz w:val="20"/>
+                <w:szCs w:val="20"/>
+              </w:rPr>
+            </w:pPr>
+          </w:p>
+        </w:tc>
+        <w:tc>
+          <w:tcPr>
+            <w:tcW w:w="911" w:type="pct"/>
+          </w:tcPr>
+          <w:p>
+            <w:pPr>
+              <w:cnfStyle w:val="000000100000" w:firstRow="0" w:lastRow="0" w:firstColumn="0" w:lastColumn="0" w:oddVBand="0" w:evenVBand="0" w:oddHBand="1" w:evenHBand="0" w:firstRowFirstColumn="0" w:firstRowLastColumn="0" w:lastRowFirstColumn="0" w:lastRowLastColumn="0"/>
+              <w:rPr>
+                <w:sz w:val="20"/>
+                <w:szCs w:val="20"/>
+              </w:rPr>
+            </w:pPr>
+          </w:p>
+        </w:tc>
+        <w:tc>
+          <w:tcPr>
+            <w:tcW w:w="801" w:type="pct"/>
+          </w:tcPr>
+          <w:p>
+            <w:pPr>
+              <w:cnfStyle w:val="000000100000" w:firstRow="0" w:lastRow="0" w:firstColumn="0" w:lastColumn="0" w:oddVBand="0" w:evenVBand="0" w:oddHBand="1" w:evenHBand="0" w:firstRowFirstColumn="0" w:firstRowLastColumn="0" w:lastRowFirstColumn="0" w:lastRowLastColumn="0"/>
+              <w:rPr>
+                <w:sz w:val="20"/>
+                <w:szCs w:val="20"/>
+              </w:rPr>
+            </w:pPr>
+          </w:p>
+        </w:tc>
+        <w:tc>
+          <w:tcPr>
+            <w:tcW w:w="1402" w:type="pct"/>
+          </w:tcPr>
+          <w:p>
+            <w:pPr>
+              <w:cnfStyle w:val="000000100000" w:firstRow="0" w:lastRow="0" w:firstColumn="0" w:lastColumn="0" w:oddVBand="0" w:evenVBand="0" w:oddHBand="1" w:evenHBand="0" w:firstRowFirstColumn="0" w:firstRowLastColumn="0" w:lastRowFirstColumn="0" w:lastRowLastColumn="0"/>
+              <w:rPr>
+                <w:sz w:val="20"/>
+                <w:szCs w:val="20"/>
+              </w:rPr>
+            </w:pPr>
+          </w:p>
+        </w:tc>
+      </w:tr>
+      <w:tr>
+        <w:trPr>
+          <w:trHeight w:val="292"/>
+        </w:trPr>
+        <w:tc>
+          <w:tcPr>
+            <w:cnfStyle w:val="001000000000" w:firstRow="0" w:lastRow="0" w:firstColumn="1" w:lastColumn="0" w:oddVBand="0" w:evenVBand="0" w:oddHBand="0" w:evenHBand="0" w:firstRowFirstColumn="0" w:firstRowLastColumn="0" w:lastRowFirstColumn="0" w:lastRowLastColumn="0"/>
+            <w:tcW w:w="343" w:type="pct"/>
+          </w:tcPr>
+          <w:p>
+            <w:pPr>
+              <w:rPr>
+                <w:sz w:val="20"/>
+                <w:szCs w:val="20"/>
+              </w:rPr>
+            </w:pPr>
+          </w:p>
+        </w:tc>
+        <w:tc>
+          <w:tcPr>
+            <w:tcW w:w="1542" w:type="pct"/>
+          </w:tcPr>
+          <w:p>
+            <w:pPr>
+              <w:cnfStyle w:val="000000000000" w:firstRow="0" w:lastRow="0" w:firstColumn="0" w:lastColumn="0" w:oddVBand="0" w:evenVBand="0" w:oddHBand="0" w:evenHBand="0" w:firstRowFirstColumn="0" w:firstRowLastColumn="0" w:lastRowFirstColumn="0" w:lastRowLastColumn="0"/>
+              <w:rPr>
+                <w:sz w:val="20"/>
+                <w:szCs w:val="20"/>
+              </w:rPr>
+            </w:pPr>
+          </w:p>
+        </w:tc>
+        <w:tc>
+          <w:tcPr>
+            <w:tcW w:w="911" w:type="pct"/>
+          </w:tcPr>
+          <w:p>
+            <w:pPr>
+              <w:cnfStyle w:val="000000000000" w:firstRow="0" w:lastRow="0" w:firstColumn="0" w:lastColumn="0" w:oddVBand="0" w:evenVBand="0" w:oddHBand="0" w:evenHBand="0" w:firstRowFirstColumn="0" w:firstRowLastColumn="0" w:lastRowFirstColumn="0" w:lastRowLastColumn="0"/>
+              <w:rPr>
+                <w:sz w:val="20"/>
+                <w:szCs w:val="20"/>
+              </w:rPr>
+            </w:pPr>
+          </w:p>
+        </w:tc>
+        <w:tc>
+          <w:tcPr>
+            <w:tcW w:w="801" w:type="pct"/>
+          </w:tcPr>
+          <w:p>
+            <w:pPr>
+              <w:cnfStyle w:val="000000000000" w:firstRow="0" w:lastRow="0" w:firstColumn="0" w:lastColumn="0" w:oddVBand="0" w:evenVBand="0" w:oddHBand="0" w:evenHBand="0" w:firstRowFirstColumn="0" w:firstRowLastColumn="0" w:lastRowFirstColumn="0" w:lastRowLastColumn="0"/>
+              <w:rPr>
+                <w:sz w:val="20"/>
+                <w:szCs w:val="20"/>
+              </w:rPr>
+            </w:pPr>
+          </w:p>
+        </w:tc>
+        <w:tc>
+          <w:tcPr>
+            <w:tcW w:w="1402" w:type="pct"/>
+          </w:tcPr>
+          <w:p>
+            <w:pPr>
+              <w:cnfStyle w:val="000000000000" w:firstRow="0" w:lastRow="0" w:firstColumn="0" w:lastColumn="0" w:oddVBand="0" w:evenVBand="0" w:oddHBand="0" w:evenHBand="0" w:firstRowFirstColumn="0" w:firstRowLastColumn="0" w:lastRowFirstColumn="0" w:lastRowLastColumn="0"/>
+              <w:rPr>
+                <w:sz w:val="20"/>
+                <w:szCs w:val="20"/>
+              </w:rPr>
+            </w:pPr>
+          </w:p>
+        </w:tc>
+      </w:tr>
+    </w:tbl>
     <w:p/>
     <w:sectPr>
       <w:pgSz w:w="12240" w:h="15840"/>

</xml_diff>